<commit_message>
Anexó informes de la entrega 2 de packet tracer
</commit_message>
<xml_diff>
--- a/ENTREGA_2_PKT/Informe_Entrega2_Telematica.docx
+++ b/ENTREGA_2_PKT/Informe_Entrega2_Telematica.docx
@@ -105,14 +105,35 @@
       <w:pPr>
         <w:spacing w:before="60" w:after="60"/>
         <w:jc w:val="center"/>
-      </w:pPr>
-      <w:r>
         <w:rPr>
           <w:i/>
           <w:iCs/>
           <w:color w:val="666666"/>
         </w:rPr>
-        <w:t>Integrantes: (completar con nombres del grupo)</w:t>
+      </w:pPr>
+      <w:r>
+        <w:rPr>
+          <w:i/>
+          <w:iCs/>
+          <w:color w:val="666666"/>
+        </w:rPr>
+        <w:t>Integrantes: (</w:t>
+      </w:r>
+      <w:r>
+        <w:rPr>
+          <w:i/>
+          <w:iCs/>
+          <w:color w:val="666666"/>
+        </w:rPr>
+        <w:t>Kevin Pabón, Santiago Mafla, Geronimo Montes, Pablo Cardona</w:t>
+      </w:r>
+      <w:r>
+        <w:rPr>
+          <w:i/>
+          <w:iCs/>
+          <w:color w:val="666666"/>
+        </w:rPr>
+        <w:t>)</w:t>
       </w:r>
     </w:p>
     <w:p>
@@ -9988,7 +10009,6 @@
   <w:style w:type="character" w:default="1" w:styleId="Fuentedeprrafopredeter">
     <w:name w:val="Default Paragraph Font"/>
     <w:uiPriority w:val="1"/>
-    <w:semiHidden/>
     <w:unhideWhenUsed/>
   </w:style>
   <w:style w:type="table" w:default="1" w:styleId="Tablanormal">

</xml_diff>